<commit_message>
Fix company name: ECI Technology, a KLA Company
</commit_message>
<xml_diff>
--- a/assets/resumes/Ayomide_Ajibola_Software_Engineer_Resume.docx
+++ b/assets/resumes/Ayomide_Ajibola_Software_Engineer_Resume.docx
@@ -72,7 +72,7 @@
           <w:rFonts w:ascii="Calibri" w:hAnsi="Calibri"/>
           <w:sz w:val="18"/>
         </w:rPr>
-        <w:t>I want to utilize my accelerated dual-degree background in Computational Science &amp; Engineering (B.S. &amp; M.S., 3.5 GPA) and corporate internship experience at KLA-Tencor to break into the tech industry as an entry-level Software Engineer, Backend Engineer, or QA/Test Automation Engineer. Skilled in distributed data engineering (PySpark, PostgreSQL), full-stack application development, automated test engineering, and cloud deployment (AWS Certified), with strong competencies in Python, Java, C++, SQL, Bash, Git, and CI/CD automation.</w:t>
+        <w:t>I want to utilize my accelerated dual-degree background in Computational Science &amp; Engineering (B.S. &amp; M.S., 3.5 GPA) and corporate internship experience at ECI Technology, a KLA Company to break into the tech industry as an entry-level Software Engineer, Backend Engineer, or QA/Test Automation Engineer. Skilled in distributed data engineering (PySpark, PostgreSQL), full-stack application development, automated test engineering, and cloud deployment (AWS Certified), with strong competencies in Python, Java, C++, SQL, Bash, Git, and CI/CD automation.</w:t>
       </w:r>
     </w:p>
     <w:p>
@@ -407,7 +407,7 @@
                 <w:i/>
                 <w:sz w:val="19"/>
               </w:rPr>
-              <w:t xml:space="preserve"> | ECI / KLA-Tencor Corporation</w:t>
+              <w:t xml:space="preserve"> | ECI Technology, a KLA Company</w:t>
             </w:r>
           </w:p>
         </w:tc>

</xml_diff>